<commit_message>
Write-up: point each scenario at the portal video's start time
Scenarios without their own Drive link now read "portal video (this
submission's Video link), from mm:ss" using exact offsets inside
level1-all-scenarios.mp4 (submission/portal-index.json, sums to the
13:05 cut); runs not in the portal link to the copy in the public repo.
Only the team name placeholder remains.

Co-Authored-By: Claude Opus 5.5 <noreply@anthropic.com>
Claude-Session: https://claude.ai/code/session_019q57MveENocAWa46vX9ztD
</commit_message>
<xml_diff>
--- a/submission/WRITEUP.docx
+++ b/submission/WRITEUP.docx
@@ -2,7 +2,7 @@
 <file path=word/document.xml><?xml version="1.0" encoding="utf-8"?>
 <w:document xmlns:w="http://schemas.openxmlformats.org/wordprocessingml/2006/main" xmlns:m="http://schemas.openxmlformats.org/officeDocument/2006/math" xmlns:r="http://schemas.openxmlformats.org/officeDocument/2006/relationships" xmlns:o="urn:schemas-microsoft-com:office:office" xmlns:v="urn:schemas-microsoft-com:vml" xmlns:w10="urn:schemas-microsoft-com:office:word" xmlns:a="http://schemas.openxmlformats.org/drawingml/2006/main" xmlns:pic="http://schemas.openxmlformats.org/drawingml/2006/picture" xmlns:wp="http://schemas.openxmlformats.org/drawingml/2006/wordprocessingDrawing">
   <w:body>
-    <w:bookmarkStart w:id="27" w:name="tireless-hand--level-1-evaluation"/>
+    <w:bookmarkStart w:id="32" w:name="tireless-hand--level-1-evaluation"/>
     <w:p>
       <w:pPr>
         <w:pStyle w:val="Heading1"/>
@@ -63,6 +63,42 @@
       </w:r>
       <w:r>
         <w:t xml:space="preserve">14 numbered scenarios: 10 caught mutations (3/5 agent-generated, 8/8 seed; the one bug both sets produced is counted once) and 4 real bugs in the original kit. 0 false alarms on the clean kit and two harmless changes. The agent's 2 misses are reported honestly in their own section.</w:t>
+      </w:r>
+    </w:p>
+    <w:p>
+      <w:pPr>
+        <w:pStyle w:val="BodyText"/>
+      </w:pPr>
+      <w:r>
+        <w:rPr>
+          <w:b/>
+          <w:bCs/>
+        </w:rPr>
+        <w:t xml:space="preserve">Videos:</w:t>
+      </w:r>
+      <w:r>
+        <w:t xml:space="preserve"> </w:t>
+      </w:r>
+      <w:r>
+        <w:t xml:space="preserve">every numbered scenario is in one real-time recording, the Video link of this submission (</w:t>
+      </w:r>
+      <w:r>
+        <w:rPr>
+          <w:rStyle w:val="VerbatimChar"/>
+        </w:rPr>
+        <w:t xml:space="preserve">level1-all-scenarios.mp4</w:t>
+      </w:r>
+      <w:r>
+        <w:t xml:space="preserve">), 13:05 long; each scenario states where it starts. Each run is also available as its own file in the repository (</w:t>
+      </w:r>
+      <w:r>
+        <w:rPr>
+          <w:rStyle w:val="VerbatimChar"/>
+        </w:rPr>
+        <w:t xml:space="preserve">submission/videos/</w:t>
+      </w:r>
+      <w:r>
+        <w:t xml:space="preserve">).</w:t>
       </w:r>
     </w:p>
     <w:bookmarkStart w:id="9" w:name="Xacee5cba3735e45d0260c9f1dac2425679f80ea"/>
@@ -968,7 +1004,7 @@
       </w:r>
     </w:p>
     <w:bookmarkEnd w:id="9"/>
-    <w:bookmarkStart w:id="24" w:name="X1b67c4cf90af502015c1b31feceb4b781e19016"/>
+    <w:bookmarkStart w:id="27" w:name="X1b67c4cf90af502015c1b31feceb4b781e19016"/>
     <w:p>
       <w:pPr>
         <w:pStyle w:val="Heading2"/>
@@ -1125,7 +1161,7 @@
               <w:pStyle w:val="Compact"/>
             </w:pPr>
             <w:r>
-              <w:t xml:space="preserve">{{LINK:K-gen-02-hspeed-wrong-source.mp4}}</w:t>
+              <w:t xml:space="preserve">portal video (this submission's Video link), from 00:00</w:t>
             </w:r>
           </w:p>
         </w:tc>
@@ -1193,7 +1229,7 @@
               <w:pStyle w:val="Compact"/>
             </w:pPr>
             <w:r>
-              <w:t xml:space="preserve">{{LINK:K-gen-03-device-name-raw-html.mp4}}</w:t>
+              <w:t xml:space="preserve">portal video (this submission's Video link), from 00:49</w:t>
             </w:r>
           </w:p>
         </w:tc>
@@ -1261,7 +1297,7 @@
               <w:pStyle w:val="Compact"/>
             </w:pPr>
             <w:r>
-              <w:t xml:space="preserve">{{LINK:K-gen-05-video-tile-removed.mp4}}</w:t>
+              <w:t xml:space="preserve">portal video (this submission's Video link), from 01:35</w:t>
             </w:r>
           </w:p>
         </w:tc>
@@ -1329,7 +1365,7 @@
               <w:pStyle w:val="Compact"/>
             </w:pPr>
             <w:r>
-              <w:t xml:space="preserve">{{LINK:K-m1-badge-always-connected.mp4}}</w:t>
+              <w:t xml:space="preserve">portal video (this submission's Video link), from 02:21</w:t>
             </w:r>
           </w:p>
         </w:tc>
@@ -1397,7 +1433,7 @@
               <w:pStyle w:val="Compact"/>
             </w:pPr>
             <w:r>
-              <w:t xml:space="preserve">{{LINK:K-m2-online-shown-offline.mp4}}</w:t>
+              <w:t xml:space="preserve">portal video (this submission's Video link), from 03:07</w:t>
             </w:r>
           </w:p>
         </w:tc>
@@ -1465,7 +1501,7 @@
               <w:pStyle w:val="Compact"/>
             </w:pPr>
             <w:r>
-              <w:t xml:space="preserve">{{LINK:K-m3-battery-off-by-10.mp4}}</w:t>
+              <w:t xml:space="preserve">portal video (this submission's Video link), from 03:54</w:t>
             </w:r>
           </w:p>
         </w:tc>
@@ -1533,7 +1569,7 @@
               <w:pStyle w:val="Compact"/>
             </w:pPr>
             <w:r>
-              <w:t xml:space="preserve">{{LINK:K-m4-wrong-drone-telemetry.mp4}}</w:t>
+              <w:t xml:space="preserve">portal video (this submission's Video link), from 04:44</w:t>
             </w:r>
           </w:p>
         </w:tc>
@@ -1601,7 +1637,7 @@
               <w:pStyle w:val="Compact"/>
             </w:pPr>
             <w:r>
-              <w:t xml:space="preserve">{{LINK:K-m5-flying-shown-as-landed.mp4}}</w:t>
+              <w:t xml:space="preserve">portal video (this submission's Video link), from 05:43</w:t>
             </w:r>
           </w:p>
         </w:tc>
@@ -1669,7 +1705,7 @@
               <w:pStyle w:val="Compact"/>
             </w:pPr>
             <w:r>
-              <w:t xml:space="preserve">{{LINK:K-m6-connection-badge-removed.mp4}}</w:t>
+              <w:t xml:space="preserve">portal video (this submission's Video link), from 06:32</w:t>
             </w:r>
           </w:p>
         </w:tc>
@@ -1737,7 +1773,7 @@
               <w:pStyle w:val="Compact"/>
             </w:pPr>
             <w:r>
-              <w:t xml:space="preserve">{{LINK:K-m7-device-list-offscreen-phone.mp4}}</w:t>
+              <w:t xml:space="preserve">portal video (this submission's Video link), from 07:18</w:t>
             </w:r>
           </w:p>
         </w:tc>
@@ -1805,7 +1841,7 @@
               <w:pStyle w:val="Compact"/>
             </w:pPr>
             <w:r>
-              <w:t xml:space="preserve">{{LINK:S1.mp4}}</w:t>
+              <w:t xml:space="preserve">portal video (this submission's Video link), from 08:08</w:t>
             </w:r>
           </w:p>
         </w:tc>
@@ -1873,7 +1909,7 @@
               <w:pStyle w:val="Compact"/>
             </w:pPr>
             <w:r>
-              <w:t xml:space="preserve">{{LINK:S2.mp4}}</w:t>
+              <w:t xml:space="preserve">portal video (this submission's Video link), from 08:53</w:t>
             </w:r>
           </w:p>
         </w:tc>
@@ -1941,7 +1977,7 @@
               <w:pStyle w:val="Compact"/>
             </w:pPr>
             <w:r>
-              <w:t xml:space="preserve">{{LINK:S3.mp4}}</w:t>
+              <w:t xml:space="preserve">portal video (this submission's Video link), from 09:48</w:t>
             </w:r>
           </w:p>
         </w:tc>
@@ -2009,7 +2045,7 @@
               <w:pStyle w:val="Compact"/>
             </w:pPr>
             <w:r>
-              <w:t xml:space="preserve">{{LINK:S4.mp4}}</w:t>
+              <w:t xml:space="preserve">portal video (this submission's Video link), from 10:23</w:t>
             </w:r>
           </w:p>
         </w:tc>
@@ -2076,9 +2112,14 @@
             <w:pPr>
               <w:pStyle w:val="Compact"/>
             </w:pPr>
-            <w:r>
-              <w:t xml:space="preserve">{{LINK:K-gen-01-video-live-shown-off.mp4}}</w:t>
-            </w:r>
+            <w:hyperlink r:id="rId10">
+              <w:r>
+                <w:rPr>
+                  <w:rStyle w:val="Hyperlink"/>
+                </w:rPr>
+                <w:t xml:space="preserve">recording in the repository</w:t>
+              </w:r>
+            </w:hyperlink>
           </w:p>
         </w:tc>
       </w:tr>
@@ -2144,14 +2185,19 @@
             <w:pPr>
               <w:pStyle w:val="Compact"/>
             </w:pPr>
-            <w:r>
-              <w:t xml:space="preserve">{{LINK:K-gen-04-left-panel-clipped-phone.mp4}}</w:t>
-            </w:r>
+            <w:hyperlink r:id="rId11">
+              <w:r>
+                <w:rPr>
+                  <w:rStyle w:val="Hyperlink"/>
+                </w:rPr>
+                <w:t xml:space="preserve">recording in the repository</w:t>
+              </w:r>
+            </w:hyperlink>
           </w:p>
         </w:tc>
       </w:tr>
     </w:tbl>
-    <w:bookmarkStart w:id="10" w:name="X7791e2192dc5e0aaed6cf28855315773fcdeb96"/>
+    <w:bookmarkStart w:id="12" w:name="X7791e2192dc5e0aaed6cf28855315773fcdeb96"/>
     <w:p>
       <w:pPr>
         <w:pStyle w:val="Heading3"/>
@@ -2593,7 +2639,7 @@
         <w:t xml:space="preserve"> </w:t>
       </w:r>
       <w:r>
-        <w:t xml:space="preserve">{{LINK:K-gen-02-hspeed-wrong-source.mp4}}</w:t>
+        <w:t xml:space="preserve">portal video (this submission's Video link), from 00:00</w:t>
       </w:r>
     </w:p>
     <w:p>
@@ -2603,8 +2649,8 @@
         </w:pict>
       </w:r>
     </w:p>
-    <w:bookmarkEnd w:id="10"/>
-    <w:bookmarkStart w:id="11" w:name="X4868a96792215bcb3024f301a1dd595017e6fe7"/>
+    <w:bookmarkEnd w:id="12"/>
+    <w:bookmarkStart w:id="14" w:name="X4868a96792215bcb3024f301a1dd595017e6fe7"/>
     <w:p>
       <w:pPr>
         <w:pStyle w:val="Heading3"/>
@@ -3139,8 +3185,19 @@
         <w:t xml:space="preserve"> </w:t>
       </w:r>
       <w:r>
-        <w:t xml:space="preserve">{{LINK:K-gen-03-device-name-raw-html.mp4}} · seed m8 run: {{LINK:K-m8-xss-drone-name.mp4}}</w:t>
-      </w:r>
+        <w:t xml:space="preserve">portal video (this submission's Video link), from 00:49 · seed m8 run:</w:t>
+      </w:r>
+      <w:r>
+        <w:t xml:space="preserve"> </w:t>
+      </w:r>
+      <w:hyperlink r:id="rId13">
+        <w:r>
+          <w:rPr>
+            <w:rStyle w:val="Hyperlink"/>
+          </w:rPr>
+          <w:t xml:space="preserve">recording in the repository</w:t>
+        </w:r>
+      </w:hyperlink>
     </w:p>
     <w:p>
       <w:r>
@@ -3149,8 +3206,8 @@
         </w:pict>
       </w:r>
     </w:p>
-    <w:bookmarkEnd w:id="11"/>
-    <w:bookmarkStart w:id="12" w:name="X6c16aa405573cd90a8bc3273e852ed177604374"/>
+    <w:bookmarkEnd w:id="14"/>
+    <w:bookmarkStart w:id="15" w:name="X6c16aa405573cd90a8bc3273e852ed177604374"/>
     <w:p>
       <w:pPr>
         <w:pStyle w:val="Heading3"/>
@@ -3619,7 +3676,7 @@
         <w:t xml:space="preserve"> </w:t>
       </w:r>
       <w:r>
-        <w:t xml:space="preserve">{{LINK:K-gen-05-video-tile-removed.mp4}}</w:t>
+        <w:t xml:space="preserve">portal video (this submission's Video link), from 01:35</w:t>
       </w:r>
     </w:p>
     <w:p>
@@ -3629,8 +3686,8 @@
         </w:pict>
       </w:r>
     </w:p>
-    <w:bookmarkEnd w:id="12"/>
-    <w:bookmarkStart w:id="13" w:name="Xe78a8f0003e20ad30faf901aa785bb98a7603fd"/>
+    <w:bookmarkEnd w:id="15"/>
+    <w:bookmarkStart w:id="16" w:name="Xe78a8f0003e20ad30faf901aa785bb98a7603fd"/>
     <w:p>
       <w:pPr>
         <w:pStyle w:val="Heading3"/>
@@ -4075,7 +4132,7 @@
         <w:t xml:space="preserve"> </w:t>
       </w:r>
       <w:r>
-        <w:t xml:space="preserve">{{LINK:K-m1-badge-always-connected.mp4}}</w:t>
+        <w:t xml:space="preserve">portal video (this submission's Video link), from 02:21</w:t>
       </w:r>
     </w:p>
     <w:p>
@@ -4085,8 +4142,8 @@
         </w:pict>
       </w:r>
     </w:p>
-    <w:bookmarkEnd w:id="13"/>
-    <w:bookmarkStart w:id="14" w:name="Xa0adf6f814ac09af6ef0840139d6698e0680fcc"/>
+    <w:bookmarkEnd w:id="16"/>
+    <w:bookmarkStart w:id="17" w:name="Xa0adf6f814ac09af6ef0840139d6698e0680fcc"/>
     <w:p>
       <w:pPr>
         <w:pStyle w:val="Heading3"/>
@@ -4513,7 +4570,7 @@
         <w:t xml:space="preserve"> </w:t>
       </w:r>
       <w:r>
-        <w:t xml:space="preserve">{{LINK:K-m2-online-shown-offline.mp4}}</w:t>
+        <w:t xml:space="preserve">portal video (this submission's Video link), from 03:07</w:t>
       </w:r>
     </w:p>
     <w:p>
@@ -4523,8 +4580,8 @@
         </w:pict>
       </w:r>
     </w:p>
-    <w:bookmarkEnd w:id="14"/>
-    <w:bookmarkStart w:id="15" w:name="X71248b6d1f7e49c04285e40ae6e2a7a7b25362e"/>
+    <w:bookmarkEnd w:id="17"/>
+    <w:bookmarkStart w:id="18" w:name="X71248b6d1f7e49c04285e40ae6e2a7a7b25362e"/>
     <w:p>
       <w:pPr>
         <w:pStyle w:val="Heading3"/>
@@ -4960,7 +5017,7 @@
         <w:t xml:space="preserve"> </w:t>
       </w:r>
       <w:r>
-        <w:t xml:space="preserve">{{LINK:K-m3-battery-off-by-10.mp4}}</w:t>
+        <w:t xml:space="preserve">portal video (this submission's Video link), from 03:54</w:t>
       </w:r>
     </w:p>
     <w:p>
@@ -4970,8 +5027,8 @@
         </w:pict>
       </w:r>
     </w:p>
-    <w:bookmarkEnd w:id="15"/>
-    <w:bookmarkStart w:id="16" w:name="X09448c8fa467cf0849c7b749e15e2e7a6baeed6"/>
+    <w:bookmarkEnd w:id="18"/>
+    <w:bookmarkStart w:id="19" w:name="X09448c8fa467cf0849c7b749e15e2e7a6baeed6"/>
     <w:p>
       <w:pPr>
         <w:pStyle w:val="Heading3"/>
@@ -5416,7 +5473,7 @@
         <w:t xml:space="preserve"> </w:t>
       </w:r>
       <w:r>
-        <w:t xml:space="preserve">{{LINK:K-m4-wrong-drone-telemetry.mp4}}</w:t>
+        <w:t xml:space="preserve">portal video (this submission's Video link), from 04:44</w:t>
       </w:r>
     </w:p>
     <w:p>
@@ -5426,8 +5483,8 @@
         </w:pict>
       </w:r>
     </w:p>
-    <w:bookmarkEnd w:id="16"/>
-    <w:bookmarkStart w:id="17" w:name="Xe97aa992442e5a42e8bed1ad26b7963fe9ad31a"/>
+    <w:bookmarkEnd w:id="19"/>
+    <w:bookmarkStart w:id="20" w:name="Xe97aa992442e5a42e8bed1ad26b7963fe9ad31a"/>
     <w:p>
       <w:pPr>
         <w:pStyle w:val="Heading3"/>
@@ -5875,7 +5932,7 @@
         <w:t xml:space="preserve"> </w:t>
       </w:r>
       <w:r>
-        <w:t xml:space="preserve">{{LINK:K-m5-flying-shown-as-landed.mp4}}</w:t>
+        <w:t xml:space="preserve">portal video (this submission's Video link), from 05:43</w:t>
       </w:r>
     </w:p>
     <w:p>
@@ -5885,8 +5942,8 @@
         </w:pict>
       </w:r>
     </w:p>
-    <w:bookmarkEnd w:id="17"/>
-    <w:bookmarkStart w:id="18" w:name="Xb6b8696f290012d16cdad2eb017c9701b52f83d"/>
+    <w:bookmarkEnd w:id="20"/>
+    <w:bookmarkStart w:id="21" w:name="Xb6b8696f290012d16cdad2eb017c9701b52f83d"/>
     <w:p>
       <w:pPr>
         <w:pStyle w:val="Heading3"/>
@@ -6358,7 +6415,7 @@
         <w:t xml:space="preserve"> </w:t>
       </w:r>
       <w:r>
-        <w:t xml:space="preserve">{{LINK:K-m6-connection-badge-removed.mp4}}</w:t>
+        <w:t xml:space="preserve">portal video (this submission's Video link), from 06:32</w:t>
       </w:r>
     </w:p>
     <w:p>
@@ -6368,8 +6425,8 @@
         </w:pict>
       </w:r>
     </w:p>
-    <w:bookmarkEnd w:id="18"/>
-    <w:bookmarkStart w:id="19" w:name="X329c32b5c05ff161e5f2a0c16984747e1f533aa"/>
+    <w:bookmarkEnd w:id="21"/>
+    <w:bookmarkStart w:id="22" w:name="X329c32b5c05ff161e5f2a0c16984747e1f533aa"/>
     <w:p>
       <w:pPr>
         <w:pStyle w:val="Heading3"/>
@@ -6814,7 +6871,7 @@
         <w:t xml:space="preserve"> </w:t>
       </w:r>
       <w:r>
-        <w:t xml:space="preserve">{{LINK:K-m7-device-list-offscreen-phone.mp4}}</w:t>
+        <w:t xml:space="preserve">portal video (this submission's Video link), from 07:18</w:t>
       </w:r>
     </w:p>
     <w:p>
@@ -6824,8 +6881,8 @@
         </w:pict>
       </w:r>
     </w:p>
-    <w:bookmarkEnd w:id="19"/>
-    <w:bookmarkStart w:id="20" w:name="X63a3d59b6935c61def0e1e12c047ed3adeb7ceb"/>
+    <w:bookmarkEnd w:id="22"/>
+    <w:bookmarkStart w:id="23" w:name="X63a3d59b6935c61def0e1e12c047ed3adeb7ceb"/>
     <w:p>
       <w:pPr>
         <w:pStyle w:val="Heading3"/>
@@ -8334,7 +8391,7 @@
         <w:t xml:space="preserve"> </w:t>
       </w:r>
       <w:r>
-        <w:t xml:space="preserve">{{LINK:S1.mp4}}</w:t>
+        <w:t xml:space="preserve">portal video (this submission's Video link), from 08:08</w:t>
       </w:r>
     </w:p>
     <w:p>
@@ -8344,8 +8401,8 @@
         </w:pict>
       </w:r>
     </w:p>
-    <w:bookmarkEnd w:id="20"/>
-    <w:bookmarkStart w:id="21" w:name="X9d52fb9a21e18bba129c1d0f47450265e62f661"/>
+    <w:bookmarkEnd w:id="23"/>
+    <w:bookmarkStart w:id="24" w:name="X9d52fb9a21e18bba129c1d0f47450265e62f661"/>
     <w:p>
       <w:pPr>
         <w:pStyle w:val="Heading3"/>
@@ -9216,7 +9273,7 @@
         <w:t xml:space="preserve"> </w:t>
       </w:r>
       <w:r>
-        <w:t xml:space="preserve">{{LINK:S2.mp4}}</w:t>
+        <w:t xml:space="preserve">portal video (this submission's Video link), from 08:53</w:t>
       </w:r>
     </w:p>
     <w:p>
@@ -9226,8 +9283,8 @@
         </w:pict>
       </w:r>
     </w:p>
-    <w:bookmarkEnd w:id="21"/>
-    <w:bookmarkStart w:id="22" w:name="Xd3ff4d0d6b49a213b60c55b58862127e0d2102f"/>
+    <w:bookmarkEnd w:id="24"/>
+    <w:bookmarkStart w:id="25" w:name="Xd3ff4d0d6b49a213b60c55b58862127e0d2102f"/>
     <w:p>
       <w:pPr>
         <w:pStyle w:val="Heading3"/>
@@ -10013,7 +10070,7 @@
         <w:t xml:space="preserve"> </w:t>
       </w:r>
       <w:r>
-        <w:t xml:space="preserve">{{LINK:S3.mp4}}</w:t>
+        <w:t xml:space="preserve">portal video (this submission's Video link), from 09:48</w:t>
       </w:r>
     </w:p>
     <w:p>
@@ -10023,8 +10080,8 @@
         </w:pict>
       </w:r>
     </w:p>
-    <w:bookmarkEnd w:id="22"/>
-    <w:bookmarkStart w:id="23" w:name="Xf03049423116766df3e117bcb4ab36db58458b7"/>
+    <w:bookmarkEnd w:id="25"/>
+    <w:bookmarkStart w:id="26" w:name="Xf03049423116766df3e117bcb4ab36db58458b7"/>
     <w:p>
       <w:pPr>
         <w:pStyle w:val="Heading3"/>
@@ -10781,12 +10838,12 @@
         <w:t xml:space="preserve"> </w:t>
       </w:r>
       <w:r>
-        <w:t xml:space="preserve">{{LINK:S4.mp4}}</w:t>
-      </w:r>
-    </w:p>
-    <w:bookmarkEnd w:id="23"/>
-    <w:bookmarkEnd w:id="24"/>
-    <w:bookmarkStart w:id="25" w:name="Xe05710bd13070f22cbedd9bcda6e1c81ef9c0c0"/>
+        <w:t xml:space="preserve">portal video (this submission's Video link), from 10:23</w:t>
+      </w:r>
+    </w:p>
+    <w:bookmarkEnd w:id="26"/>
+    <w:bookmarkEnd w:id="27"/>
+    <w:bookmarkStart w:id="28" w:name="Xe05710bd13070f22cbedd9bcda6e1c81ef9c0c0"/>
     <w:p>
       <w:pPr>
         <w:pStyle w:val="Heading2"/>
@@ -10869,8 +10926,19 @@
         <w:t xml:space="preserve"> </w:t>
       </w:r>
       <w:r>
-        <w:t xml:space="preserve">&gt; 0, frame hashes changing), run on a machine with the live stream up. Video: {{LINK:K-gen-01-video-live-shown-off.mp4}}</w:t>
-      </w:r>
+        <w:t xml:space="preserve">&gt; 0, frame hashes changing), run on a machine with the live stream up. Video:</w:t>
+      </w:r>
+      <w:r>
+        <w:t xml:space="preserve"> </w:t>
+      </w:r>
+      <w:hyperlink r:id="rId10">
+        <w:r>
+          <w:rPr>
+            <w:rStyle w:val="Hyperlink"/>
+          </w:rPr>
+          <w:t xml:space="preserve">recording in the repository</w:t>
+        </w:r>
+      </w:hyperlink>
     </w:p>
     <w:p>
       <w:pPr>
@@ -10914,11 +10982,22 @@
         <w:t xml:space="preserve"> </w:t>
       </w:r>
       <w:r>
-        <w:t xml:space="preserve">to the phone side panel, clipping the telemetry below its fold. The unmodified kit already hides telemetry on phones (real bug S4 below), so “telemetry visible on a phone” cannot be a clean-passing invariant. K6 checks that interactive controls stay reachable; all four device-row controls still fit at 390 px, so control reachability is genuinely unchanged. The mutation worsens a pre-existing defect instead of introducing a newly detectable one. Video: {{LINK:K-gen-04-left-panel-clipped-phone.mp4}}</w:t>
-      </w:r>
-    </w:p>
-    <w:bookmarkEnd w:id="25"/>
-    <w:bookmarkStart w:id="26" w:name="Xcdeaed92c2394a543cfc2c2a3d11eb297d43593"/>
+        <w:t xml:space="preserve">to the phone side panel, clipping the telemetry below its fold. The unmodified kit already hides telemetry on phones (real bug S4 below), so “telemetry visible on a phone” cannot be a clean-passing invariant. K6 checks that interactive controls stay reachable; all four device-row controls still fit at 390 px, so control reachability is genuinely unchanged. The mutation worsens a pre-existing defect instead of introducing a newly detectable one. Video:</w:t>
+      </w:r>
+      <w:r>
+        <w:t xml:space="preserve"> </w:t>
+      </w:r>
+      <w:hyperlink r:id="rId11">
+        <w:r>
+          <w:rPr>
+            <w:rStyle w:val="Hyperlink"/>
+          </w:rPr>
+          <w:t xml:space="preserve">recording in the repository</w:t>
+        </w:r>
+      </w:hyperlink>
+    </w:p>
+    <w:bookmarkEnd w:id="28"/>
+    <w:bookmarkStart w:id="31" w:name="Xcdeaed92c2394a543cfc2c2a3d11eb297d43593"/>
     <w:p>
       <w:pPr>
         <w:pStyle w:val="Heading2"/>
@@ -10954,7 +11033,7 @@
         <w:t xml:space="preserve"> </w:t>
       </w:r>
       <w:r>
-        <w:t xml:space="preserve">all seven checks pass on the unmodified kit (all 7 invariants hold). Video: {{LINK:K-clean.mp4}}</w:t>
+        <w:t xml:space="preserve">all seven checks pass on the unmodified kit (all 7 invariants hold). Video: portal video (this submission's Video link), from 12:18</w:t>
       </w:r>
     </w:p>
     <w:p>
@@ -10976,8 +11055,19 @@
         <w:t xml:space="preserve"> </w:t>
       </w:r>
       <w:r>
-        <w:t xml:space="preserve">all 7 invariants hold: elements found through visible text and labels instead. Video: {{LINK:K-h1-testids-renamed.mp4}}</w:t>
-      </w:r>
+        <w:t xml:space="preserve">all 7 invariants hold: elements found through visible text and labels instead. Video:</w:t>
+      </w:r>
+      <w:r>
+        <w:t xml:space="preserve"> </w:t>
+      </w:r>
+      <w:hyperlink r:id="rId29">
+        <w:r>
+          <w:rPr>
+            <w:rStyle w:val="Hyperlink"/>
+          </w:rPr>
+          <w:t xml:space="preserve">recording in the repository</w:t>
+        </w:r>
+      </w:hyperlink>
     </w:p>
     <w:p>
       <w:pPr>
@@ -10998,8 +11088,19 @@
         <w:t xml:space="preserve"> </w:t>
       </w:r>
       <w:r>
-        <w:t xml:space="preserve">(“FlytBase Cockpit”→“FlytBase Operations”, “Devices”→“Fleet”, “socket …”→“link …”). all 7 invariants hold: meaning is compared, not text. Video: {{LINK:K-h2-wording-change.mp4}}</w:t>
-      </w:r>
+        <w:t xml:space="preserve">(“FlytBase Cockpit”→“FlytBase Operations”, “Devices”→“Fleet”, “socket …”→“link …”). all 7 invariants hold: meaning is compared, not text. Video:</w:t>
+      </w:r>
+      <w:r>
+        <w:t xml:space="preserve"> </w:t>
+      </w:r>
+      <w:hyperlink r:id="rId30">
+        <w:r>
+          <w:rPr>
+            <w:rStyle w:val="Hyperlink"/>
+          </w:rPr>
+          <w:t xml:space="preserve">recording in the repository</w:t>
+        </w:r>
+      </w:hyperlink>
     </w:p>
     <w:p>
       <w:pPr>
@@ -11020,7 +11121,7 @@
         <w:t xml:space="preserve"> </w:t>
       </w:r>
       <w:r>
-        <w:t xml:space="preserve">README says "down where it is"; backend (latest commit: return-to-dock landing) flew 70 m back and landed on the dock in 15.4 s. Cockpit followed it: in_flight → landing → standby, altitude/distance within tolerance in 100 % of 21 samples, final 0.0 m / 0 m. Video: {{LINK:P1.mp4}}</w:t>
+        <w:t xml:space="preserve">README says "down where it is"; backend (latest commit: return-to-dock landing) flew 70 m back and landed on the dock in 15.4 s. Cockpit followed it: in_flight → landing → standby, altitude/distance within tolerance in 100 % of 21 samples, final 0.0 m / 0 m. Video: portal video (this submission's Video link), from 10:55</w:t>
       </w:r>
     </w:p>
     <w:p>
@@ -11051,11 +11152,11 @@
         <w:t xml:space="preserve">qa/mutants/control-fix-stale.patch</w:t>
       </w:r>
       <w:r>
-        <w:t xml:space="preserve">): PASS: UI flagged stale data after 4.1 s. Video: {{LINK:S1-fixed.mp4}}</w:t>
-      </w:r>
-    </w:p>
-    <w:bookmarkEnd w:id="26"/>
-    <w:bookmarkEnd w:id="27"/>
+        <w:t xml:space="preserve">): PASS: UI flagged stale data after 4.1 s. Video: portal video (this submission's Video link), from 11:34</w:t>
+      </w:r>
+    </w:p>
+    <w:bookmarkEnd w:id="31"/>
+    <w:bookmarkEnd w:id="32"/>
     <w:sectPr>
       <w:footnotePr>
         <w:numRestart w:val="eachSect"/>

</xml_diff>